<commit_message>
docs: Laporan TA individu untuk semua bentuk TA (v1.1.0)
Setiap mahasiswa wajib menyerahkan Laporan TA individu. Pada TA kelompok,
tiap anggota menyusun laporan dengan judul berbeda yang membahas bagian
tanggung jawabnya; judul ditetapkan saat sempro. Tambah sub-bab 5.1.3,
sesuaikan Tabel 3.1/3.2/3.9/3.10, 3.3.2, 3.4, 3.5.2, 3.6.2, 5.7, Bab 7,
Lampiran 6 (md + docx), dan slide sosialisasi.

Co-Authored-By: Claude Opus 5.5 <noreply@anthropic.com>
</commit_message>
<xml_diff>
--- a/formulir/lampiran-6-pembagian-kerja-tim.docx
+++ b/formulir/lampiran-6-pembagian-kerja-tim.docx
@@ -176,10 +176,11 @@
         <w:tblLook w:firstRow="1" w:lastRow="0" w:firstColumn="0" w:lastColumn="0" w:noHBand="0" w:noVBand="0" w:val="0020"/>
       </w:tblPr>
       <w:tblGrid>
-        <w:gridCol w:w="1980"/>
-        <w:gridCol w:w="1980"/>
-        <w:gridCol w:w="1980"/>
-        <w:gridCol w:w="1980"/>
+        <w:gridCol w:w="554"/>
+        <w:gridCol w:w="1742"/>
+        <w:gridCol w:w="1188"/>
+        <w:gridCol w:w="2217"/>
+        <w:gridCol w:w="2217"/>
       </w:tblGrid>
       <w:tr>
         <w:trPr>
@@ -233,6 +234,18 @@
             </w:r>
           </w:p>
         </w:tc>
+        <w:tc>
+          <w:tcPr/>
+          <w:p>
+            <w:pPr>
+              <w:pStyle w:val="Compact"/>
+              <w:jc w:val="left"/>
+            </w:pPr>
+            <w:r>
+              <w:t>Judul Laporan TA Individu</w:t>
+            </w:r>
+          </w:p>
+        </w:tc>
       </w:tr>
       <w:tr>
         <w:tc>
@@ -271,6 +284,14 @@
             </w:pPr>
           </w:p>
         </w:tc>
+        <w:tc>
+          <w:tcPr/>
+          <w:p>
+            <w:pPr>
+              <w:pStyle w:val="Compact"/>
+            </w:pPr>
+          </w:p>
+        </w:tc>
       </w:tr>
       <w:tr>
         <w:tc>
@@ -309,6 +330,14 @@
             </w:pPr>
           </w:p>
         </w:tc>
+        <w:tc>
+          <w:tcPr/>
+          <w:p>
+            <w:pPr>
+              <w:pStyle w:val="Compact"/>
+            </w:pPr>
+          </w:p>
+        </w:tc>
       </w:tr>
       <w:tr>
         <w:tc>
@@ -347,6 +376,14 @@
             </w:pPr>
           </w:p>
         </w:tc>
+        <w:tc>
+          <w:tcPr/>
+          <w:p>
+            <w:pPr>
+              <w:pStyle w:val="Compact"/>
+            </w:pPr>
+          </w:p>
+        </w:tc>
       </w:tr>
       <w:tr>
         <w:tc>
@@ -385,6 +422,14 @@
             </w:pPr>
           </w:p>
         </w:tc>
+        <w:tc>
+          <w:tcPr/>
+          <w:p>
+            <w:pPr>
+              <w:pStyle w:val="Compact"/>
+            </w:pPr>
+          </w:p>
+        </w:tc>
       </w:tr>
       <w:tr>
         <w:tc>
@@ -397,6 +442,14 @@
             <w:r>
               <w:t xml:space="preserve">5</w:t>
             </w:r>
+          </w:p>
+        </w:tc>
+        <w:tc>
+          <w:tcPr/>
+          <w:p>
+            <w:pPr>
+              <w:pStyle w:val="Compact"/>
+            </w:pPr>
           </w:p>
         </w:tc>
         <w:tc>
@@ -456,6 +509,35 @@
       <w:r>
         <w:t xml:space="preserve">Berkomitmen menjalankan tugas masing-masing secara profesional, tepat waktu, dan dengan integritas akademik yang tinggi.</w:t>
       </w:r>
+    </w:p>
+    <w:p>
+      <w:pPr>
+        <w:pStyle w:val="Compact"/>
+        <w:numPr>
+          <w:ilvl w:val="0"/>
+          <w:numId w:val="1001"/>
+        </w:numPr>
+      </w:pPr>
+      <w:r>
+        <w:t>Memahami bahwa setiap anggota wajib menyusun Laporan TA individu dengan judul berbeda sesuai bagian tanggung jawabnya (Bab 5.1.3 Pedoman TA), dan judul tersebut telah ditetapkan paling lambat saat seminar proposal.</w:t>
+      </w:r>
+      <w:r/>
+      <w:r>
+        <w:rPr>
+          <w:i/>
+          <w:iCs/>
+        </w:rPr>
+      </w:r>
+      <w:r/>
+      <w:r/>
+      <w:r>
+        <w:rPr>
+          <w:i/>
+          <w:iCs/>
+        </w:rPr>
+      </w:r>
+      <w:r/>
+      <w:r/>
     </w:p>
     <w:p>
       <w:pPr>

</xml_diff>